<commit_message>
adjust report format, move picture down
</commit_message>
<xml_diff>
--- a/exp2qcdt/TEST_OUTPUTS/Quartet_RNA_report.docx
+++ b/exp2qcdt/TEST_OUTPUTS/Quartet_RNA_report.docx
@@ -794,12 +794,6 @@
       </w:tr>
     </w:tbl>
     <w:p>
-      <w:pPr/>
-      <w:r>
-        <w:br w:type="page"/>
-      </w:r>
-    </w:p>
-    <w:p>
       <w:pPr>
         <w:pStyle w:val="2"/>
       </w:pPr>
@@ -837,6 +831,62 @@
       </w:pPr>
       <w:r>
         <w:t xml:space="preserve">定义为在给定样本对之间，测试数据集中比值型表达水平与对应比值型参考数据集之间的 Pearson 相关系数，用于表征比值表达谱在数值层面的整体一致性趋势。为提高分析可靠性，在进行比值表达分析前，首先对每个样本组的技术重复取均值。差异倍数（fold change）采用 log2 转换。</w:t>
+      </w:r>
+    </w:p>
+    <w:p>
+      <w:pPr>
+        <w:pStyle w:val="2"/>
+      </w:pPr>
+      <w:r>
+        <w:t xml:space="preserve">参考文献</w:t>
+      </w:r>
+    </w:p>
+    <w:p>
+      <w:pPr>
+        <w:pStyle w:val="a"/>
+      </w:pPr>
+      <w:r>
+        <w:t xml:space="preserve">1. Zheng, Y. et al. Multi-omics data integration using ratio-based quantitative profiling with Quartet reference materials. Nature Biotechnology 1–17 (2023).</w:t>
+      </w:r>
+    </w:p>
+    <w:p>
+      <w:pPr>
+        <w:pStyle w:val="a"/>
+      </w:pPr>
+      <w:r>
+        <w:t xml:space="preserve">2. Yu, Y. et al. Quartet RNA reference materials improve the quality of transcriptomic data through ratio-based profiling. Nature biotechnology 1–15 (2023).</w:t>
+      </w:r>
+    </w:p>
+    <w:p>
+      <w:pPr>
+        <w:pStyle w:val="a"/>
+      </w:pPr>
+      <w:r>
+        <w:t xml:space="preserve">3. 上海临床队列组学检测工作指引（征求意见稿）, 2025/11/26.</w:t>
+      </w:r>
+    </w:p>
+    <w:p>
+      <w:pPr>
+        <w:pStyle w:val="a"/>
+      </w:pPr>
+      <w:r>
+        <w:t xml:space="preserve"> </w:t>
+      </w:r>
+    </w:p>
+    <w:p>
+      <w:pPr>
+        <w:pStyle w:val="3"/>
+      </w:pPr>
+      <w:r>
+        <w:t xml:space="preserve">免责声明</w:t>
+      </w:r>
+    </w:p>
+    <w:p>
+      <w:pPr>
+        <w:pStyle w:val="a"/>
+      </w:pPr>
+      <w:r>
+        <w:t xml:space="preserve">本数据质量报告仅针对所评估的特定数据集提供分析结果，仅供信息参考之用。尽管已尽最大努力确保分析结果的准确性和可靠性，但本报告按“现状（AS IS）”提供，不附带任何形式的明示或暗示担保。报告作者及发布方不对基于本报告内容所采取的任何行动承担责任。本报告中的结论不应被视为对任何产品或流程质量的最终判定，也不应用于关键应用场景、商业决策或法规合规用途，除非经过专业核查和独立验证。对于分析结果的正确性、准确性、可靠性或适用性，不作任何明示或暗示的保证。</w:t>
       </w:r>
     </w:p>
     <w:p>
@@ -955,68 +1005,6 @@
             </a:graphic>
           </wp:inline>
         </w:drawing>
-      </w:r>
-    </w:p>
-    <w:p>
-      <w:pPr/>
-      <w:r>
-        <w:br w:type="page"/>
-      </w:r>
-    </w:p>
-    <w:p>
-      <w:pPr>
-        <w:pStyle w:val="2"/>
-      </w:pPr>
-      <w:r>
-        <w:t xml:space="preserve">参考文献</w:t>
-      </w:r>
-    </w:p>
-    <w:p>
-      <w:pPr>
-        <w:pStyle w:val="a"/>
-      </w:pPr>
-      <w:r>
-        <w:t xml:space="preserve">1. Zheng, Y. et al. Multi-omics data integration using ratio-based quantitative profiling with Quartet reference materials. Nature Biotechnology 1–17 (2023).</w:t>
-      </w:r>
-    </w:p>
-    <w:p>
-      <w:pPr>
-        <w:pStyle w:val="a"/>
-      </w:pPr>
-      <w:r>
-        <w:t xml:space="preserve">2. Yu, Y. et al. Quartet RNA reference materials improve the quality of transcriptomic data through ratio-based profiling. Nature biotechnology 1–15 (2023).</w:t>
-      </w:r>
-    </w:p>
-    <w:p>
-      <w:pPr>
-        <w:pStyle w:val="a"/>
-      </w:pPr>
-      <w:r>
-        <w:t xml:space="preserve">3. 上海临床队列组学检测工作指引（征求意见稿）, 2025/11/26.</w:t>
-      </w:r>
-    </w:p>
-    <w:p>
-      <w:pPr>
-        <w:pStyle w:val="a"/>
-      </w:pPr>
-      <w:r>
-        <w:t xml:space="preserve"> </w:t>
-      </w:r>
-    </w:p>
-    <w:p>
-      <w:pPr>
-        <w:pStyle w:val="3"/>
-      </w:pPr>
-      <w:r>
-        <w:t xml:space="preserve">免责声明</w:t>
-      </w:r>
-    </w:p>
-    <w:p>
-      <w:pPr>
-        <w:pStyle w:val="a"/>
-      </w:pPr>
-      <w:r>
-        <w:t xml:space="preserve">本数据质量报告仅针对所评估的特定数据集提供分析结果，仅供信息参考之用。尽管已尽最大努力确保分析结果的准确性和可靠性，但本报告按“现状（AS IS）”提供，不附带任何形式的明示或暗示担保。报告作者及发布方不对基于本报告内容所采取的任何行动承担责任。本报告中的结论不应被视为对任何产品或流程质量的最终判定，也不应用于关键应用场景、商业决策或法规合规用途，除非经过专业核查和独立验证。对于分析结果的正确性、准确性、可靠性或适用性，不作任何明示或暗示的保证。</w:t>
       </w:r>
     </w:p>
     <w:sectPr>

</xml_diff>

<commit_message>
change template and PCC color
</commit_message>
<xml_diff>
--- a/exp2qcdt/TEST_OUTPUTS/Quartet_RNA_report.docx
+++ b/exp2qcdt/TEST_OUTPUTS/Quartet_RNA_report.docx
@@ -6,7 +6,7 @@
       <w:pPr>
         <w:jc w:val="left"/>
         <w:rPr>
-          <w:rFonts w:ascii="Times New Roman" w:eastAsiaTheme="minorEastAsia" w:hAnsi="Times New Roman" w:cs="Times New Roman"/>
+          <w:rFonts w:eastAsiaTheme="minorEastAsia" w:cs="Times New Roman"/>
           <w:sz w:val="22"/>
           <w:szCs w:val="22"/>
           <w:lang w:eastAsia="zh-CN"/>
@@ -18,7 +18,7 @@
       <w:bookmarkStart w:id="3" w:name="OLE_LINK2"/>
       <w:r>
         <w:rPr>
-          <w:rFonts w:ascii="Times New Roman" w:eastAsiaTheme="minorEastAsia" w:hAnsi="Times New Roman" w:cs="Times New Roman"/>
+          <w:rFonts w:eastAsiaTheme="minorEastAsia" w:cs="Times New Roman"/>
           <w:b/>
           <w:bCs/>
           <w:noProof/>
@@ -84,9 +84,20 @@
     </w:p>
     <w:p>
       <w:pPr>
+        <w:pStyle w:val="2"/>
+        <w:jc w:val="center"/>
+        <w:rPr>
+          <w:rFonts w:ascii="宋体" w:eastAsia="宋体" w:hAnsi="宋体" w:cs="Times New Roman"/>
+          <w:sz w:val="32"/>
+          <w:szCs w:val="32"/>
+        </w:rPr>
+      </w:pPr>
+    </w:p>
+    <w:p>
+      <w:pPr>
         <w:jc w:val="left"/>
         <w:rPr>
-          <w:rFonts w:ascii="Times New Roman" w:eastAsia="宋体" w:hAnsi="Times New Roman" w:cs="Times New Roman"/>
+          <w:rFonts w:cs="Times New Roman"/>
           <w:sz w:val="22"/>
           <w:szCs w:val="22"/>
           <w:lang w:eastAsia="zh-CN"/>
@@ -114,7 +125,7 @@
         <w:pStyle w:val="a"/>
       </w:pPr>
       <w:r>
-        <w:t xml:space="preserve">本报告基于多项组学关键质量控制指标，总结了 Quartet RNA 参考物质所生成数据的质量情况。质量控制流程从用户输入基因表达矩阵开始，分别计算每批次的信噪比（Signal-to-Noise Ratio, SNR）、与参考数据集的相对相关性（Relative Correlation with Reference Datasets, RC）及整体质量判断。</w:t>
+        <w:t xml:space="preserve">本报告基于多项组学关键质量控制指标，总结了 Quartet RNA 参考物质所生成数据的质量情况。质量控制流程从用户输入基因表达矩阵开始，分别计算外部质控品的信噪比（Signal-to-Noise Ratio, SNR）、与参考数据集的Pearson相关系数（Pearson correlation coefficient, PCC）及整体质量判断。</w:t>
       </w:r>
     </w:p>
     <w:p>
@@ -173,7 +184,7 @@
               <w:spacing w:after="100" w:before="100" w:line="240"/>
               <w:ind w:left="100" w:right="100" w:firstLine="0" w:firstLineChars="0"/>
               <w:rPr>
-                <w:rFonts w:ascii="Helvetica" w:hAnsi="Helvetica" w:eastAsia="Helvetica" w:cs="Helvetica"/>
+                <w:rFonts w:ascii="Times New Roman" w:hAnsi="Times New Roman" w:eastAsia="Times New Roman" w:cs="Times New Roman"/>
                 <w:i w:val="false"/>
                 <w:b w:val="true"/>
                 <w:u w:val="none"/>
@@ -184,7 +195,7 @@
             </w:pPr>
             <w:r>
               <w:rPr>
-                <w:rFonts w:ascii="Helvetica" w:hAnsi="Helvetica" w:eastAsia="Helvetica" w:cs="Helvetica"/>
+                <w:rFonts w:ascii="Times New Roman" w:hAnsi="Times New Roman" w:eastAsia="Times New Roman" w:cs="Times New Roman"/>
                 <w:i w:val="false"/>
                 <w:b w:val="true"/>
                 <w:u w:val="none"/>
@@ -192,7 +203,7 @@
                 <w:szCs w:val="22"/>
                 <w:color w:val="000000"/>
               </w:rPr>
-              <w:t xml:space="preserve">批次</w:t>
+              <w:t xml:space="preserve">样本组</w:t>
             </w:r>
           </w:p>
         </w:tc>
@@ -226,7 +237,7 @@
               <w:spacing w:after="100" w:before="100" w:line="240"/>
               <w:ind w:left="100" w:right="100" w:firstLine="0" w:firstLineChars="0"/>
               <w:rPr>
-                <w:rFonts w:ascii="Helvetica" w:hAnsi="Helvetica" w:eastAsia="Helvetica" w:cs="Helvetica"/>
+                <w:rFonts w:ascii="Times New Roman" w:hAnsi="Times New Roman" w:eastAsia="Times New Roman" w:cs="Times New Roman"/>
                 <w:i w:val="false"/>
                 <w:b w:val="true"/>
                 <w:u w:val="none"/>
@@ -237,7 +248,7 @@
             </w:pPr>
             <w:r>
               <w:rPr>
-                <w:rFonts w:ascii="Helvetica" w:hAnsi="Helvetica" w:eastAsia="Helvetica" w:cs="Helvetica"/>
+                <w:rFonts w:ascii="Times New Roman" w:hAnsi="Times New Roman" w:eastAsia="Times New Roman" w:cs="Times New Roman"/>
                 <w:i w:val="false"/>
                 <w:b w:val="true"/>
                 <w:u w:val="none"/>
@@ -279,7 +290,7 @@
               <w:spacing w:after="100" w:before="100" w:line="240"/>
               <w:ind w:left="100" w:right="100" w:firstLine="0" w:firstLineChars="0"/>
               <w:rPr>
-                <w:rFonts w:ascii="Helvetica" w:hAnsi="Helvetica" w:eastAsia="Helvetica" w:cs="Helvetica"/>
+                <w:rFonts w:ascii="Times New Roman" w:hAnsi="Times New Roman" w:eastAsia="Times New Roman" w:cs="Times New Roman"/>
                 <w:i w:val="false"/>
                 <w:b w:val="true"/>
                 <w:u w:val="none"/>
@@ -290,7 +301,7 @@
             </w:pPr>
             <w:r>
               <w:rPr>
-                <w:rFonts w:ascii="Helvetica" w:hAnsi="Helvetica" w:eastAsia="Helvetica" w:cs="Helvetica"/>
+                <w:rFonts w:ascii="Times New Roman" w:hAnsi="Times New Roman" w:eastAsia="Times New Roman" w:cs="Times New Roman"/>
                 <w:i w:val="false"/>
                 <w:b w:val="true"/>
                 <w:u w:val="none"/>
@@ -298,7 +309,7 @@
                 <w:szCs w:val="22"/>
                 <w:color w:val="000000"/>
               </w:rPr>
-              <w:t xml:space="preserve">相对相关性</w:t>
+              <w:t xml:space="preserve">Pearson相关系数</w:t>
             </w:r>
           </w:p>
         </w:tc>
@@ -332,7 +343,7 @@
               <w:spacing w:after="100" w:before="100" w:line="240"/>
               <w:ind w:left="100" w:right="100" w:firstLine="0" w:firstLineChars="0"/>
               <w:rPr>
-                <w:rFonts w:ascii="Helvetica" w:hAnsi="Helvetica" w:eastAsia="Helvetica" w:cs="Helvetica"/>
+                <w:rFonts w:ascii="Times New Roman" w:hAnsi="Times New Roman" w:eastAsia="Times New Roman" w:cs="Times New Roman"/>
                 <w:i w:val="false"/>
                 <w:b w:val="true"/>
                 <w:u w:val="none"/>
@@ -343,7 +354,7 @@
             </w:pPr>
             <w:r>
               <w:rPr>
-                <w:rFonts w:ascii="Helvetica" w:hAnsi="Helvetica" w:eastAsia="Helvetica" w:cs="Helvetica"/>
+                <w:rFonts w:ascii="Times New Roman" w:hAnsi="Times New Roman" w:eastAsia="Times New Roman" w:cs="Times New Roman"/>
                 <w:i w:val="false"/>
                 <w:b w:val="true"/>
                 <w:u w:val="none"/>
@@ -351,7 +362,7 @@
                 <w:szCs w:val="22"/>
                 <w:color w:val="000000"/>
               </w:rPr>
-              <w:t xml:space="preserve">整体质量</w:t>
+              <w:t xml:space="preserve">是否通过</w:t>
             </w:r>
           </w:p>
         </w:tc>
@@ -391,7 +402,7 @@
               <w:spacing w:after="100" w:before="100" w:line="240"/>
               <w:ind w:left="100" w:right="100" w:firstLine="0" w:firstLineChars="0"/>
               <w:rPr>
-                <w:rFonts w:ascii="Helvetica" w:hAnsi="Helvetica" w:eastAsia="Helvetica" w:cs="Helvetica"/>
+                <w:rFonts w:ascii="Times New Roman" w:hAnsi="Times New Roman" w:eastAsia="Times New Roman" w:cs="Times New Roman"/>
                 <w:i w:val="false"/>
                 <w:b w:val="true"/>
                 <w:u w:val="none"/>
@@ -402,7 +413,7 @@
             </w:pPr>
             <w:r>
               <w:rPr>
-                <w:rFonts w:ascii="Helvetica" w:hAnsi="Helvetica" w:eastAsia="Helvetica" w:cs="Helvetica"/>
+                <w:rFonts w:ascii="Times New Roman" w:hAnsi="Times New Roman" w:eastAsia="Times New Roman" w:cs="Times New Roman"/>
                 <w:i w:val="false"/>
                 <w:b w:val="true"/>
                 <w:u w:val="none"/>
@@ -444,7 +455,7 @@
               <w:spacing w:after="100" w:before="100" w:line="240"/>
               <w:ind w:left="100" w:right="100" w:firstLine="0" w:firstLineChars="0"/>
               <w:rPr>
-                <w:rFonts w:ascii="Helvetica" w:hAnsi="Helvetica" w:eastAsia="Helvetica" w:cs="Helvetica"/>
+                <w:rFonts w:ascii="Times New Roman" w:hAnsi="Times New Roman" w:eastAsia="Times New Roman" w:cs="Times New Roman"/>
                 <w:i w:val="false"/>
                 <w:b w:val="true"/>
                 <w:u w:val="none"/>
@@ -455,7 +466,7 @@
             </w:pPr>
             <w:r>
               <w:rPr>
-                <w:rFonts w:ascii="Helvetica" w:hAnsi="Helvetica" w:eastAsia="Helvetica" w:cs="Helvetica"/>
+                <w:rFonts w:ascii="Times New Roman" w:hAnsi="Times New Roman" w:eastAsia="Times New Roman" w:cs="Times New Roman"/>
                 <w:i w:val="false"/>
                 <w:b w:val="true"/>
                 <w:u w:val="none"/>
@@ -497,7 +508,7 @@
               <w:spacing w:after="100" w:before="100" w:line="240"/>
               <w:ind w:left="100" w:right="100" w:firstLine="0" w:firstLineChars="0"/>
               <w:rPr>
-                <w:rFonts w:ascii="Helvetica" w:hAnsi="Helvetica" w:eastAsia="Helvetica" w:cs="Helvetica"/>
+                <w:rFonts w:ascii="Times New Roman" w:hAnsi="Times New Roman" w:eastAsia="Times New Roman" w:cs="Times New Roman"/>
                 <w:i w:val="false"/>
                 <w:b w:val="true"/>
                 <w:u w:val="none"/>
@@ -508,7 +519,7 @@
             </w:pPr>
             <w:r>
               <w:rPr>
-                <w:rFonts w:ascii="Helvetica" w:hAnsi="Helvetica" w:eastAsia="Helvetica" w:cs="Helvetica"/>
+                <w:rFonts w:ascii="Times New Roman" w:hAnsi="Times New Roman" w:eastAsia="Times New Roman" w:cs="Times New Roman"/>
                 <w:i w:val="false"/>
                 <w:b w:val="true"/>
                 <w:u w:val="none"/>
@@ -550,7 +561,7 @@
               <w:spacing w:after="100" w:before="100" w:line="240"/>
               <w:ind w:left="100" w:right="100" w:firstLine="0" w:firstLineChars="0"/>
               <w:rPr>
-                <w:rFonts w:ascii="Helvetica" w:hAnsi="Helvetica" w:eastAsia="Helvetica" w:cs="Helvetica"/>
+                <w:rFonts w:ascii="Times New Roman" w:hAnsi="Times New Roman" w:eastAsia="Times New Roman" w:cs="Times New Roman"/>
                 <w:i w:val="false"/>
                 <w:b w:val="true"/>
                 <w:u w:val="none"/>
@@ -561,7 +572,7 @@
             </w:pPr>
             <w:r>
               <w:rPr>
-                <w:rFonts w:ascii="Helvetica" w:hAnsi="Helvetica" w:eastAsia="Helvetica" w:cs="Helvetica"/>
+                <w:rFonts w:ascii="Times New Roman" w:hAnsi="Times New Roman" w:eastAsia="Times New Roman" w:cs="Times New Roman"/>
                 <w:i w:val="false"/>
                 <w:b w:val="true"/>
                 <w:u w:val="none"/>
@@ -569,7 +580,7 @@
                 <w:szCs w:val="22"/>
                 <w:color w:val="000000"/>
               </w:rPr>
-              <w:t xml:space="preserve">全部通过</w:t>
+              <w:t xml:space="preserve">-</w:t>
             </w:r>
           </w:p>
         </w:tc>
@@ -609,7 +620,7 @@
               <w:spacing w:after="100" w:before="100" w:line="240"/>
               <w:ind w:left="100" w:right="100" w:firstLine="0" w:firstLineChars="0"/>
               <w:rPr>
-                <w:rFonts w:ascii="Helvetica" w:hAnsi="Helvetica" w:eastAsia="Helvetica" w:cs="Helvetica"/>
+                <w:rFonts w:ascii="Times New Roman" w:hAnsi="Times New Roman" w:eastAsia="Times New Roman" w:cs="Times New Roman"/>
                 <w:i w:val="false"/>
                 <w:b w:val="false"/>
                 <w:u w:val="none"/>
@@ -620,7 +631,7 @@
             </w:pPr>
             <w:r>
               <w:rPr>
-                <w:rFonts w:ascii="Helvetica" w:hAnsi="Helvetica" w:eastAsia="Helvetica" w:cs="Helvetica"/>
+                <w:rFonts w:ascii="Times New Roman" w:hAnsi="Times New Roman" w:eastAsia="Times New Roman" w:cs="Times New Roman"/>
                 <w:i w:val="false"/>
                 <w:b w:val="false"/>
                 <w:u w:val="none"/>
@@ -662,7 +673,7 @@
               <w:spacing w:after="100" w:before="100" w:line="240"/>
               <w:ind w:left="100" w:right="100" w:firstLine="0" w:firstLineChars="0"/>
               <w:rPr>
-                <w:rFonts w:ascii="Helvetica" w:hAnsi="Helvetica" w:eastAsia="Helvetica" w:cs="Helvetica"/>
+                <w:rFonts w:ascii="Times New Roman" w:hAnsi="Times New Roman" w:eastAsia="Times New Roman" w:cs="Times New Roman"/>
                 <w:i w:val="false"/>
                 <w:b w:val="false"/>
                 <w:u w:val="none"/>
@@ -673,7 +684,7 @@
             </w:pPr>
             <w:r>
               <w:rPr>
-                <w:rFonts w:ascii="Helvetica" w:hAnsi="Helvetica" w:eastAsia="Helvetica" w:cs="Helvetica"/>
+                <w:rFonts w:ascii="Times New Roman" w:hAnsi="Times New Roman" w:eastAsia="Times New Roman" w:cs="Times New Roman"/>
                 <w:i w:val="false"/>
                 <w:b w:val="false"/>
                 <w:u w:val="none"/>
@@ -715,26 +726,26 @@
               <w:spacing w:after="100" w:before="100" w:line="240"/>
               <w:ind w:left="100" w:right="100" w:firstLine="0" w:firstLineChars="0"/>
               <w:rPr>
-                <w:rFonts w:ascii="Helvetica" w:hAnsi="Helvetica" w:eastAsia="Helvetica" w:cs="Helvetica"/>
+                <w:rFonts w:ascii="Times New Roman" w:hAnsi="Times New Roman" w:eastAsia="Times New Roman" w:cs="Times New Roman"/>
                 <w:i w:val="false"/>
                 <w:b w:val="false"/>
                 <w:u w:val="none"/>
                 <w:sz w:val="22"/>
                 <w:szCs w:val="22"/>
-                <w:color w:val="B80D0D"/>
+                <w:color w:val="000000"/>
               </w:rPr>
             </w:pPr>
             <w:r>
               <w:rPr>
-                <w:rFonts w:ascii="Helvetica" w:hAnsi="Helvetica" w:eastAsia="Helvetica" w:cs="Helvetica"/>
+                <w:rFonts w:ascii="Times New Roman" w:hAnsi="Times New Roman" w:eastAsia="Times New Roman" w:cs="Times New Roman"/>
                 <w:i w:val="false"/>
                 <w:b w:val="false"/>
                 <w:u w:val="none"/>
                 <w:sz w:val="22"/>
                 <w:szCs w:val="22"/>
-                <w:color w:val="B80D0D"/>
+                <w:color w:val="000000"/>
               </w:rPr>
-              <w:t xml:space="preserve">0.59 ↓</w:t>
+              <w:t xml:space="preserve">0.59</w:t>
             </w:r>
           </w:p>
         </w:tc>
@@ -768,26 +779,26 @@
               <w:spacing w:after="100" w:before="100" w:line="240"/>
               <w:ind w:left="100" w:right="100" w:firstLine="0" w:firstLineChars="0"/>
               <w:rPr>
-                <w:rFonts w:ascii="Helvetica" w:hAnsi="Helvetica" w:eastAsia="Helvetica" w:cs="Helvetica"/>
+                <w:rFonts w:ascii="Times New Roman" w:hAnsi="Times New Roman" w:eastAsia="Times New Roman" w:cs="Times New Roman"/>
                 <w:i w:val="false"/>
                 <w:b w:val="false"/>
                 <w:u w:val="none"/>
                 <w:sz w:val="22"/>
                 <w:szCs w:val="22"/>
-                <w:color w:val="B80D0D"/>
+                <w:color w:val="000000"/>
               </w:rPr>
             </w:pPr>
             <w:r>
               <w:rPr>
-                <w:rFonts w:ascii="Helvetica" w:hAnsi="Helvetica" w:eastAsia="Helvetica" w:cs="Helvetica"/>
+                <w:rFonts w:ascii="Times New Roman" w:hAnsi="Times New Roman" w:eastAsia="Times New Roman" w:cs="Times New Roman"/>
                 <w:i w:val="false"/>
                 <w:b w:val="false"/>
                 <w:u w:val="none"/>
                 <w:sz w:val="22"/>
                 <w:szCs w:val="22"/>
-                <w:color w:val="B80D0D"/>
+                <w:color w:val="000000"/>
               </w:rPr>
-              <w:t xml:space="preserve">No</w:t>
+              <w:t xml:space="preserve">Yes</w:t>
             </w:r>
           </w:p>
         </w:tc>
@@ -822,7 +833,7 @@
         <w:pStyle w:val="3"/>
       </w:pPr>
       <w:r>
-        <w:t xml:space="preserve">与参考数据集的相对相关性（Relative Correlation with Reference Datasets, RC）</w:t>
+        <w:t xml:space="preserve">与参考数据集的Pearson相关系数（Pearson correlation coefficient, PCC）</w:t>
       </w:r>
     </w:p>
     <w:p>
@@ -846,7 +857,7 @@
         <w:pStyle w:val="a"/>
       </w:pPr>
       <w:r>
-        <w:t xml:space="preserve">1. Zheng, Y. et al. Multi-omics data integration using ratio-based quantitative profiling with Quartet reference materials. Nature Biotechnology 1–17 (2023).</w:t>
+        <w:t xml:space="preserve">1. Zheng Y, et al. Multi-omics data integration using ratio-based quantitative profiling with Quartet reference materials. Nature Biotechnology, 2024.</w:t>
       </w:r>
     </w:p>
     <w:p>
@@ -854,7 +865,7 @@
         <w:pStyle w:val="a"/>
       </w:pPr>
       <w:r>
-        <w:t xml:space="preserve">2. Yu, Y. et al. Quartet RNA reference materials improve the quality of transcriptomic data through ratio-based profiling. Nature biotechnology 1–15 (2023).</w:t>
+        <w:t xml:space="preserve">2. Yu, Y. et al. Quartet RNA reference materials improve the quality of transcriptomic data through ratio-based profiling. Nature biotechnology, 2024.</w:t>
       </w:r>
     </w:p>
     <w:p>
@@ -862,7 +873,15 @@
         <w:pStyle w:val="a"/>
       </w:pPr>
       <w:r>
-        <w:t xml:space="preserve">3. 上海临床队列组学检测工作指引（征求意见稿）, 2025/11/26.</w:t>
+        <w:t xml:space="preserve">3. GB/T 45214-2025《人全基因组高通量测序数据质量评价方法》</w:t>
+      </w:r>
+    </w:p>
+    <w:p>
+      <w:pPr>
+        <w:pStyle w:val="a"/>
+      </w:pPr>
+      <w:r>
+        <w:t xml:space="preserve">4. 上海临床队列组学检测工作指引（征求意见稿）, 2025/11/26.</w:t>
       </w:r>
     </w:p>
     <w:p>
@@ -959,7 +978,7 @@
         <w:pStyle w:val="2"/>
       </w:pPr>
       <w:r>
-        <w:t xml:space="preserve">Correlation with Reference Datasets</w:t>
+        <w:t xml:space="preserve">Pearson Correlation Coefficient</w:t>
       </w:r>
     </w:p>
     <w:p>
@@ -1789,11 +1808,12 @@
   <w:style w:type="paragraph" w:default="1" w:styleId="a">
     <w:name w:val="Normal"/>
     <w:qFormat/>
+    <w:rsid w:val="00EF4E71"/>
     <w:pPr>
       <w:jc w:val="both"/>
     </w:pPr>
     <w:rPr>
-      <w:rFonts w:ascii="Arial" w:eastAsia="Songti SC" w:hAnsi="Arial"/>
+      <w:rFonts w:ascii="Times New Roman" w:eastAsia="宋体" w:hAnsi="Times New Roman"/>
       <w:sz w:val="24"/>
       <w:szCs w:val="24"/>
       <w:lang w:eastAsia="en-US"/>
@@ -1806,6 +1826,7 @@
     <w:link w:val="10"/>
     <w:uiPriority w:val="9"/>
     <w:qFormat/>
+    <w:rsid w:val="00EF4E71"/>
     <w:pPr>
       <w:keepNext/>
       <w:keepLines/>
@@ -1833,6 +1854,7 @@
     <w:uiPriority w:val="9"/>
     <w:unhideWhenUsed/>
     <w:qFormat/>
+    <w:rsid w:val="00A87EF8"/>
     <w:pPr>
       <w:keepNext/>
       <w:keepLines/>
@@ -1843,7 +1865,7 @@
       <w:rFonts w:eastAsiaTheme="majorEastAsia" w:cstheme="majorBidi"/>
       <w:b/>
       <w:bCs/>
-      <w:sz w:val="36"/>
+      <w:sz w:val="28"/>
       <w:szCs w:val="26"/>
     </w:rPr>
   </w:style>
@@ -1855,6 +1877,7 @@
     <w:uiPriority w:val="9"/>
     <w:unhideWhenUsed/>
     <w:qFormat/>
+    <w:rsid w:val="00A87EF8"/>
     <w:pPr>
       <w:keepNext/>
       <w:keepLines/>
@@ -1865,7 +1888,7 @@
       <w:rFonts w:eastAsiaTheme="majorEastAsia" w:cstheme="majorBidi"/>
       <w:b/>
       <w:bCs/>
-      <w:sz w:val="32"/>
+      <w:sz w:val="28"/>
     </w:rPr>
   </w:style>
   <w:style w:type="paragraph" w:styleId="4">
@@ -2201,12 +2224,14 @@
     <w:basedOn w:val="a0"/>
     <w:link w:val="1"/>
     <w:uiPriority w:val="9"/>
+    <w:rsid w:val="00EF4E71"/>
     <w:rPr>
-      <w:rFonts w:ascii="Arial" w:eastAsiaTheme="majorEastAsia" w:hAnsi="Arial" w:cstheme="majorBidi"/>
+      <w:rFonts w:ascii="Times New Roman" w:eastAsiaTheme="majorEastAsia" w:hAnsi="Times New Roman" w:cstheme="majorBidi"/>
       <w:b/>
       <w:bCs/>
       <w:sz w:val="44"/>
       <w:szCs w:val="32"/>
+      <w:lang w:eastAsia="en-US"/>
     </w:rPr>
   </w:style>
   <w:style w:type="character" w:customStyle="1" w:styleId="20">
@@ -2214,12 +2239,14 @@
     <w:basedOn w:val="a0"/>
     <w:link w:val="2"/>
     <w:uiPriority w:val="9"/>
+    <w:rsid w:val="00A87EF8"/>
     <w:rPr>
-      <w:rFonts w:ascii="Arial" w:eastAsiaTheme="majorEastAsia" w:hAnsi="Arial" w:cstheme="majorBidi"/>
+      <w:rFonts w:ascii="Times New Roman" w:eastAsiaTheme="majorEastAsia" w:hAnsi="Times New Roman" w:cstheme="majorBidi"/>
       <w:b/>
       <w:bCs/>
-      <w:sz w:val="36"/>
+      <w:sz w:val="28"/>
       <w:szCs w:val="26"/>
+      <w:lang w:eastAsia="en-US"/>
     </w:rPr>
   </w:style>
   <w:style w:type="character" w:customStyle="1" w:styleId="30">
@@ -2227,11 +2254,14 @@
     <w:basedOn w:val="a0"/>
     <w:link w:val="3"/>
     <w:uiPriority w:val="9"/>
+    <w:rsid w:val="00A87EF8"/>
     <w:rPr>
-      <w:rFonts w:ascii="Arial" w:eastAsiaTheme="majorEastAsia" w:hAnsi="Arial" w:cstheme="majorBidi"/>
+      <w:rFonts w:ascii="Times New Roman" w:eastAsiaTheme="majorEastAsia" w:hAnsi="Times New Roman" w:cstheme="majorBidi"/>
       <w:b/>
       <w:bCs/>
-      <w:sz w:val="32"/>
+      <w:sz w:val="28"/>
+      <w:szCs w:val="24"/>
+      <w:lang w:eastAsia="en-US"/>
     </w:rPr>
   </w:style>
   <w:style w:type="paragraph" w:customStyle="1" w:styleId="ImageCaption">

</xml_diff>